<commit_message>
fix(selarl): retour humain — adresse siege autorisation + accent 'associe' renonciation
- Autorisation domiciliation : adresse du siege corrigee (modele + generateur).
  Etait 'dans les locaux situes [ville_siege] [cp_siege] [ville_siege]' (token ville
  en double, num/voie absents) -> 'dans les locaux du cabinet au [num_voie_siege]
  [voie_siege], [cp_siege] [ville_siege]' (forme exacte du retour humain / lock).
- Renonciation : valeur par defaut 'associe' -> 'associé' (accent) aux 4 endroits
  (shell, selarl_slice, data_entry).
- Verifie : ruff clean, 315 tests verts, extraits generes conformes.
- Duree autorisation (99 ans vs indeterminee) NON touchee = arbitrage Gad en attente.
- FIX statuts dentiste art.8 (euros) REVERTE : on colle au texte exact de Gad.

Co-Authored-By: Claude Opus 4.8 <noreply@anthropic.com>
</commit_message>
<xml_diff>
--- a/project/source_documents/lot_01/autorisation_domiciliation_transforme.docx
+++ b/project/source_documents/lot_01/autorisation_domiciliation_transforme.docx
@@ -266,7 +266,7 @@
           <w:szCs w:val="20"/>
           <w:rtl w:val="0"/>
         </w:rPr>
-        <w:t xml:space="preserve"> € en cours de formation, dans les locaux situés</w:t>
+        <w:t xml:space="preserve"> € en cours de formation, dans les locaux du cabinet au [num_voie_siege] [voie_siege], [cp_siege] [ville_siege]</w:t>
       </w:r>
       <w:r>
         <w:rPr>
@@ -276,7 +276,6 @@
           <w:szCs w:val="20"/>
           <w:rtl w:val="0"/>
         </w:rPr>
-        <w:t xml:space="preserve"> </w:t>
       </w:r>
       <w:sdt>
         <w:sdtPr>
@@ -326,7 +325,6 @@
           <w:szCs w:val="20"/>
           <w:rtl w:val="0"/>
         </w:rPr>
-        <w:t xml:space="preserve"> [</w:t>
       </w:r>
       <w:r>
         <w:rPr>
@@ -336,7 +334,6 @@
           <w:szCs w:val="20"/>
           <w:rtl w:val="0"/>
         </w:rPr>
-        <w:t xml:space="preserve">ville_siege</w:t>
       </w:r>
       <w:r>
         <w:rPr>
@@ -346,7 +343,6 @@
           <w:szCs w:val="20"/>
           <w:rtl w:val="0"/>
         </w:rPr>
-        <w:t xml:space="preserve">] [cp_siege] [ville_siege]</w:t>
       </w:r>
       <w:r>
         <w:rPr>

</xml_diff>